<commit_message>
feat(ai): support shorthand payment schedule 0 for immediate and N for days
</commit_message>
<xml_diff>
--- a/Ho So Du An/Hop Dong/Hop_Dong_CONG_TY_TNHH_CONG_NGHE_JINXUN_VIET_NAM_HD-20261013-001.docx
+++ b/Ho So Du An/Hop Dong/Hop_Dong_CONG_TY_TNHH_CONG_NGHE_JINXUN_VIET_NAM_HD-20261013-001.docx
@@ -2206,7 +2206,21 @@
           <w:rFonts w:ascii="Times New Roman" w:hAnsi="Times New Roman"/>
           <w:sz w:val="24"/>
         </w:rPr>
-        <w:t>60 ngàu.</w:t>
+        <w:t xml:space="preserve">60 </w:t>
+      </w:r>
+      <w:r>
+        <w:rPr>
+          <w:rFonts w:ascii="Times New Roman" w:hAnsi="Times New Roman"/>
+          <w:sz w:val="24"/>
+        </w:rPr>
+        <w:t>ngày</w:t>
+      </w:r>
+      <w:r>
+        <w:rPr>
+          <w:rFonts w:ascii="Times New Roman" w:hAnsi="Times New Roman"/>
+          <w:sz w:val="24"/>
+        </w:rPr>
+        <w:t>.</w:t>
       </w:r>
     </w:p>
     <w:p>

</xml_diff>